<commit_message>
Capa preenchida: Colégio Conde Domingos, aluno e professora
Co-Authored-By: Claude Fable 5 <noreply@anthropic.com>
Claude-Session: https://claude.ai/code/session_01SQoSxKhE1iAPeNYp3Thb3L
</commit_message>
<xml_diff>
--- a/trabalho-quimica-petroleo/Trabalho-Quimica-B-Petroleo.docx
+++ b/trabalho-quimica-petroleo/Trabalho-Quimica-B-Petroleo.docx
@@ -15,10 +15,12 @@
       <w:r>
         <w:rPr>
           <w:rFonts w:ascii="Calibri" w:cs="Calibri" w:eastAsia="Calibri" w:hAnsi="Calibri"/>
-          <w:sz w:val="26"/>
-          <w:szCs w:val="26"/>
-        </w:rPr>
-        <w:t xml:space="preserve">COLÉGIO: ________________________________________</w:t>
+          <w:b/>
+          <w:bCs/>
+          <w:sz w:val="28"/>
+          <w:szCs w:val="28"/>
+        </w:rPr>
+        <w:t xml:space="preserve">COLÉGIO CONDE DOMINGOS</w:t>
       </w:r>
     </w:p>
     <w:p>
@@ -99,7 +101,7 @@
           <w:sz w:val="26"/>
           <w:szCs w:val="26"/>
         </w:rPr>
-        <w:t xml:space="preserve">Aluno(a): ________________________________________</w:t>
+        <w:t xml:space="preserve">Aluno: João Victor Quadros Brandão</w:t>
       </w:r>
     </w:p>
     <w:p>
@@ -113,7 +115,7 @@
           <w:sz w:val="26"/>
           <w:szCs w:val="26"/>
         </w:rPr>
-        <w:t xml:space="preserve">Professora: ______________________________________</w:t>
+        <w:t xml:space="preserve">Professora: Maria Luiza de Tenani</w:t>
       </w:r>
     </w:p>
     <w:p>

</xml_diff>